<commit_message>
chore: organize repository and detail contribution records
</commit_message>
<xml_diff>
--- a/version2/Agile Workshop.docx
+++ b/version2/Agile Workshop.docx
@@ -1444,7 +1444,7 @@
         <w:spacing w:after="60" w:line="240" w:lineRule="auto"/>
       </w:pPr>
       <w:r>
-        <w:t>Status describes repository evidence, not a claim that the named student completed the item. High priorities highlight acceptance gaps. Owners and estimates are retained; the team should confirm the revised priorities.</w:t>
+        <w:t>Status describes repository evidence. First and second owners are review/fix assignments, not original authors. Confirmed authorship by PB range is recorded in the final contribution section.</w:t>
       </w:r>
     </w:p>
     <w:p>
@@ -1469,7 +1469,7 @@
         <w:spacing w:after="60" w:line="240" w:lineRule="auto"/>
       </w:pPr>
       <w:r>
-        <w:t>Priority: High. Estimate: 3. First owner: Xinran Zhang. Second owner: Cathleen.</w:t>
+        <w:t>Priority: High. Estimate: 3. First owner: Xinran Zhang. Second owner: Cathleen Liu.</w:t>
       </w:r>
     </w:p>
     <w:p>
@@ -1524,7 +1524,7 @@
         <w:spacing w:after="60" w:line="240" w:lineRule="auto"/>
       </w:pPr>
       <w:r>
-        <w:t>Priority: High. Estimate: 5. First owner: Cathleen. Second owner: Xinran Zhang.</w:t>
+        <w:t>Priority: High. Estimate: 5. First owner: Cathleen Liu. Second owner: Xinran Zhang.</w:t>
       </w:r>
     </w:p>
     <w:p>
@@ -1579,7 +1579,7 @@
         <w:spacing w:after="60" w:line="240" w:lineRule="auto"/>
       </w:pPr>
       <w:r>
-        <w:t>Priority: High. Estimate: 5. First owner: Xinran Zhang. Second owner: cyc.</w:t>
+        <w:t>Priority: High. Estimate: 5. First owner: Xinran Zhang. Second owner: Chenyu Yang.</w:t>
       </w:r>
     </w:p>
     <w:p>
@@ -1634,7 +1634,7 @@
         <w:spacing w:after="60" w:line="240" w:lineRule="auto"/>
       </w:pPr>
       <w:r>
-        <w:t>Priority: High. Estimate: 7. First owner: Cathleen. Second owner: cyc.</w:t>
+        <w:t>Priority: High. Estimate: 7. First owner: Cathleen Liu. Second owner: Chenyu Yang.</w:t>
       </w:r>
     </w:p>
     <w:p>
@@ -1689,7 +1689,7 @@
         <w:spacing w:after="60" w:line="240" w:lineRule="auto"/>
       </w:pPr>
       <w:r>
-        <w:t>Priority: High. Estimate: 3. First owner: Xinran Zhang. Second owner: Churchill.</w:t>
+        <w:t>Priority: High. Estimate: 3. First owner: Xinran Zhang. Second owner: Songjie Qiu.</w:t>
       </w:r>
     </w:p>
     <w:p>
@@ -1757,7 +1757,7 @@
         <w:spacing w:after="60" w:line="240" w:lineRule="auto"/>
       </w:pPr>
       <w:r>
-        <w:t>Priority: High. Estimate: 7. First owner: Cathleen. Second owner: Xinran Zhang.</w:t>
+        <w:t>Priority: High. Estimate: 7. First owner: Cathleen Liu. Second owner: Xinran Zhang.</w:t>
       </w:r>
     </w:p>
     <w:p>
@@ -1812,7 +1812,7 @@
         <w:spacing w:after="60" w:line="240" w:lineRule="auto"/>
       </w:pPr>
       <w:r>
-        <w:t>Priority: High. Estimate: 5. First owner: Xinran Zhang. Second owner: Cathleen.</w:t>
+        <w:t>Priority: High. Estimate: 5. First owner: Xinran Zhang. Second owner: Cathleen Liu.</w:t>
       </w:r>
     </w:p>
     <w:p>
@@ -1867,7 +1867,7 @@
         <w:spacing w:after="60" w:line="240" w:lineRule="auto"/>
       </w:pPr>
       <w:r>
-        <w:t>Priority: High. Estimate: 3. First owner: cyc. Second owner: Xinran Zhang.</w:t>
+        <w:t>Priority: High. Estimate: 3. First owner: Chenyu Yang. Second owner: Xinran Zhang.</w:t>
       </w:r>
     </w:p>
     <w:p>
@@ -1922,7 +1922,7 @@
         <w:spacing w:after="60" w:line="240" w:lineRule="auto"/>
       </w:pPr>
       <w:r>
-        <w:t>Priority: Medium. Estimate: 3. First owner: cyc. Second owner: Churchill.</w:t>
+        <w:t>Priority: Medium. Estimate: 3. First owner: Chenyu Yang. Second owner: Songjie Qiu.</w:t>
       </w:r>
     </w:p>
     <w:p>
@@ -1977,7 +1977,7 @@
         <w:spacing w:after="60" w:line="240" w:lineRule="auto"/>
       </w:pPr>
       <w:r>
-        <w:t>Priority: High. Estimate: 3. First owner: Cathleen. Second owner: Churchill.</w:t>
+        <w:t>Priority: High. Estimate: 3. First owner: Cathleen Liu. Second owner: Songjie Qiu.</w:t>
       </w:r>
     </w:p>
     <w:p>
@@ -2045,7 +2045,7 @@
         <w:spacing w:after="60" w:line="240" w:lineRule="auto"/>
       </w:pPr>
       <w:r>
-        <w:t>Priority: High. Estimate: 7. First owner: Churchill. Second owner: Cathleen.</w:t>
+        <w:t>Priority: High. Estimate: 7. First owner: Songjie Qiu. Second owner: Cathleen Liu.</w:t>
       </w:r>
     </w:p>
     <w:p>
@@ -2100,7 +2100,7 @@
         <w:spacing w:after="60" w:line="240" w:lineRule="auto"/>
       </w:pPr>
       <w:r>
-        <w:t>Priority: High. Estimate: 7. First owner: Churchill. Second owner: cyc.</w:t>
+        <w:t>Priority: High. Estimate: 7. First owner: Songjie Qiu. Second owner: Chenyu Yang.</w:t>
       </w:r>
     </w:p>
     <w:p>
@@ -2155,7 +2155,7 @@
         <w:spacing w:after="60" w:line="240" w:lineRule="auto"/>
       </w:pPr>
       <w:r>
-        <w:t>Priority: Medium. Estimate: 3. First owner: cyc. Second owner: Churchill.</w:t>
+        <w:t>Priority: Medium. Estimate: 3. First owner: Chenyu Yang. Second owner: Songjie Qiu.</w:t>
       </w:r>
     </w:p>
     <w:p>
@@ -2210,7 +2210,7 @@
         <w:spacing w:after="60" w:line="240" w:lineRule="auto"/>
       </w:pPr>
       <w:r>
-        <w:t>Priority: Medium. Estimate: 5. First owner: Cathleen. Second owner: Xinran Zhang.</w:t>
+        <w:t>Priority: Medium. Estimate: 5. First owner: Cathleen Liu. Second owner: Xinran Zhang.</w:t>
       </w:r>
     </w:p>
     <w:p>
@@ -2265,7 +2265,7 @@
         <w:spacing w:after="60" w:line="240" w:lineRule="auto"/>
       </w:pPr>
       <w:r>
-        <w:t>Priority: Medium. Estimate: 7. First owner: Churchill. Second owner: Xinran Zhang.</w:t>
+        <w:t>Priority: Medium. Estimate: 7. First owner: Songjie Qiu. Second owner: Xinran Zhang.</w:t>
       </w:r>
     </w:p>
     <w:p>
@@ -2333,7 +2333,7 @@
         <w:spacing w:after="60" w:line="240" w:lineRule="auto"/>
       </w:pPr>
       <w:r>
-        <w:t>Priority: High. Estimate: 7. First owner: Xinran Zhang. Second owner: cyc.</w:t>
+        <w:t>Priority: High. Estimate: 7. First owner: Xinran Zhang. Second owner: Chenyu Yang.</w:t>
       </w:r>
     </w:p>
     <w:p>
@@ -2388,7 +2388,7 @@
         <w:spacing w:after="60" w:line="240" w:lineRule="auto"/>
       </w:pPr>
       <w:r>
-        <w:t>Priority: High. Estimate: 7. First owner: Churchill. Second owner: Cathleen.</w:t>
+        <w:t>Priority: High. Estimate: 7. First owner: Songjie Qiu. Second owner: Cathleen Liu.</w:t>
       </w:r>
     </w:p>
     <w:p>
@@ -2443,7 +2443,7 @@
         <w:spacing w:after="60" w:line="240" w:lineRule="auto"/>
       </w:pPr>
       <w:r>
-        <w:t>Priority: Medium. Estimate: 3. First owner: cyc. Second owner: Churchill.</w:t>
+        <w:t>Priority: Medium. Estimate: 3. First owner: Chenyu Yang. Second owner: Songjie Qiu.</w:t>
       </w:r>
     </w:p>
     <w:p>
@@ -2498,7 +2498,7 @@
         <w:spacing w:after="60" w:line="240" w:lineRule="auto"/>
       </w:pPr>
       <w:r>
-        <w:t>Priority: High. Estimate: 7. First owner: Xinran Zhang. Second owner: Churchill.</w:t>
+        <w:t>Priority: High. Estimate: 7. First owner: Xinran Zhang. Second owner: Songjie Qiu.</w:t>
       </w:r>
     </w:p>
     <w:p>
@@ -2553,7 +2553,7 @@
         <w:spacing w:after="60" w:line="240" w:lineRule="auto"/>
       </w:pPr>
       <w:r>
-        <w:t>Priority: High. Estimate: 7. First owner: Churchill. Second owner: Cathleen.</w:t>
+        <w:t>Priority: High. Estimate: 7. First owner: Songjie Qiu. Second owner: Cathleen Liu.</w:t>
       </w:r>
     </w:p>
     <w:p>
@@ -2878,7 +2878,7 @@
               </w:rPr>
               <w:t>Xinran Zhang</w:t>
               <w:br/>
-              <w:t>Cathleen</w:t>
+              <w:t>Cathleen Liu</w:t>
               <w:br/>
               <w:t>Estimate 3</w:t>
             </w:r>
@@ -3046,7 +3046,7 @@
               </w:rPr>
               <w:t>Xinran Zhang</w:t>
               <w:br/>
-              <w:t>Cathleen</w:t>
+              <w:t>Cathleen Liu</w:t>
               <w:br/>
               <w:t>Estimate 3</w:t>
             </w:r>
@@ -3212,7 +3212,7 @@
                 <w:b w:val="0"/>
                 <w:sz w:val="19"/>
               </w:rPr>
-              <w:t>Cathleen</w:t>
+              <w:t>Cathleen Liu</w:t>
               <w:br/>
               <w:t>Xinran Zhang</w:t>
               <w:br/>
@@ -3382,7 +3382,7 @@
               </w:rPr>
               <w:t>Xinran Zhang</w:t>
               <w:br/>
-              <w:t>cyc</w:t>
+              <w:t>Chenyu Yang</w:t>
               <w:br/>
               <w:t>Estimate 5</w:t>
             </w:r>
@@ -3548,9 +3548,9 @@
                 <w:b w:val="0"/>
                 <w:sz w:val="19"/>
               </w:rPr>
-              <w:t>Cathleen</w:t>
+              <w:t>Cathleen Liu</w:t>
               <w:br/>
-              <w:t>cyc</w:t>
+              <w:t>Chenyu Yang</w:t>
               <w:br/>
               <w:t>Estimate 5</w:t>
             </w:r>
@@ -3716,9 +3716,9 @@
                 <w:b w:val="0"/>
                 <w:sz w:val="19"/>
               </w:rPr>
-              <w:t>Cathleen</w:t>
+              <w:t>Cathleen Liu</w:t>
               <w:br/>
-              <w:t>cyc</w:t>
+              <w:t>Chenyu Yang</w:t>
               <w:br/>
               <w:t>Estimate 3</w:t>
             </w:r>
@@ -3886,7 +3886,7 @@
               </w:rPr>
               <w:t>Xinran Zhang</w:t>
               <w:br/>
-              <w:t>Churchill</w:t>
+              <w:t>Songjie Qiu</w:t>
               <w:br/>
               <w:t>Estimate 3</w:t>
             </w:r>
@@ -4052,7 +4052,7 @@
                 <w:b w:val="0"/>
                 <w:sz w:val="19"/>
               </w:rPr>
-              <w:t>Cathleen</w:t>
+              <w:t>Cathleen Liu</w:t>
               <w:br/>
               <w:t>Xinran Zhang</w:t>
               <w:br/>
@@ -4220,7 +4220,7 @@
                 <w:b w:val="0"/>
                 <w:sz w:val="19"/>
               </w:rPr>
-              <w:t>Cathleen</w:t>
+              <w:t>Cathleen Liu</w:t>
               <w:br/>
               <w:t>Xinran Zhang</w:t>
               <w:br/>
@@ -4589,7 +4589,7 @@
               </w:rPr>
               <w:t>Xinran Zhang</w:t>
               <w:br/>
-              <w:t>Cathleen</w:t>
+              <w:t>Cathleen Liu</w:t>
               <w:br/>
               <w:t>Estimate 5</w:t>
             </w:r>
@@ -4755,7 +4755,7 @@
                 <w:b w:val="0"/>
                 <w:sz w:val="19"/>
               </w:rPr>
-              <w:t>cyc</w:t>
+              <w:t>Chenyu Yang</w:t>
               <w:br/>
               <w:t>Xinran Zhang</w:t>
               <w:br/>
@@ -4923,9 +4923,9 @@
                 <w:b w:val="0"/>
                 <w:sz w:val="19"/>
               </w:rPr>
-              <w:t>cyc</w:t>
+              <w:t>Chenyu Yang</w:t>
               <w:br/>
-              <w:t>Churchill</w:t>
+              <w:t>Songjie Qiu</w:t>
               <w:br/>
               <w:t>Estimate 3</w:t>
             </w:r>
@@ -5091,9 +5091,9 @@
                 <w:b w:val="0"/>
                 <w:sz w:val="19"/>
               </w:rPr>
-              <w:t>Cathleen</w:t>
+              <w:t>Cathleen Liu</w:t>
               <w:br/>
-              <w:t>Churchill</w:t>
+              <w:t>Songjie Qiu</w:t>
               <w:br/>
               <w:t>Estimate 3</w:t>
             </w:r>
@@ -5259,9 +5259,9 @@
                 <w:b w:val="0"/>
                 <w:sz w:val="19"/>
               </w:rPr>
-              <w:t>Churchill</w:t>
+              <w:t>Songjie Qiu</w:t>
               <w:br/>
-              <w:t>Cathleen</w:t>
+              <w:t>Cathleen Liu</w:t>
               <w:br/>
               <w:t>Estimate 7</w:t>
             </w:r>
@@ -5427,9 +5427,9 @@
                 <w:b w:val="0"/>
                 <w:sz w:val="19"/>
               </w:rPr>
-              <w:t>Churchill</w:t>
+              <w:t>Songjie Qiu</w:t>
               <w:br/>
-              <w:t>cyc</w:t>
+              <w:t>Chenyu Yang</w:t>
               <w:br/>
               <w:t>Estimate 3</w:t>
             </w:r>
@@ -5595,9 +5595,9 @@
                 <w:b w:val="0"/>
                 <w:sz w:val="19"/>
               </w:rPr>
-              <w:t>Churchill</w:t>
+              <w:t>Songjie Qiu</w:t>
               <w:br/>
-              <w:t>cyc</w:t>
+              <w:t>Chenyu Yang</w:t>
               <w:br/>
               <w:t>Estimate 5</w:t>
             </w:r>
@@ -5763,9 +5763,9 @@
                 <w:b w:val="0"/>
                 <w:sz w:val="19"/>
               </w:rPr>
-              <w:t>cyc</w:t>
+              <w:t>Chenyu Yang</w:t>
               <w:br/>
-              <w:t>Churchill</w:t>
+              <w:t>Songjie Qiu</w:t>
               <w:br/>
               <w:t>Estimate 3</w:t>
             </w:r>
@@ -5931,7 +5931,7 @@
                 <w:b w:val="0"/>
                 <w:sz w:val="19"/>
               </w:rPr>
-              <w:t>Cathleen</w:t>
+              <w:t>Cathleen Liu</w:t>
               <w:br/>
               <w:t>Xinran Zhang</w:t>
               <w:br/>
@@ -6298,7 +6298,7 @@
                 <w:b w:val="0"/>
                 <w:sz w:val="19"/>
               </w:rPr>
-              <w:t>Churchill</w:t>
+              <w:t>Songjie Qiu</w:t>
               <w:br/>
               <w:t>Xinran Zhang</w:t>
               <w:br/>
@@ -6466,7 +6466,7 @@
                 <w:b w:val="0"/>
                 <w:sz w:val="19"/>
               </w:rPr>
-              <w:t>Churchill</w:t>
+              <w:t>Songjie Qiu</w:t>
               <w:br/>
               <w:t>Xinran Zhang</w:t>
               <w:br/>
@@ -6634,7 +6634,7 @@
                 <w:b w:val="0"/>
                 <w:sz w:val="19"/>
               </w:rPr>
-              <w:t>Churchill</w:t>
+              <w:t>Songjie Qiu</w:t>
               <w:br/>
               <w:t>Xinran Zhang</w:t>
               <w:br/>
@@ -6804,7 +6804,7 @@
               </w:rPr>
               <w:t>Xinran Zhang</w:t>
               <w:br/>
-              <w:t>cyc</w:t>
+              <w:t>Chenyu Yang</w:t>
               <w:br/>
               <w:t>Estimate 9</w:t>
             </w:r>
@@ -6970,9 +6970,9 @@
                 <w:b w:val="0"/>
                 <w:sz w:val="19"/>
               </w:rPr>
-              <w:t>Churchill</w:t>
+              <w:t>Songjie Qiu</w:t>
               <w:br/>
-              <w:t>Cathleen</w:t>
+              <w:t>Cathleen Liu</w:t>
               <w:br/>
               <w:t>Estimate 5</w:t>
             </w:r>
@@ -7138,9 +7138,9 @@
                 <w:b w:val="0"/>
                 <w:sz w:val="19"/>
               </w:rPr>
-              <w:t>Churchill</w:t>
+              <w:t>Songjie Qiu</w:t>
               <w:br/>
-              <w:t>Cathleen</w:t>
+              <w:t>Cathleen Liu</w:t>
               <w:br/>
               <w:t>Estimate 7</w:t>
             </w:r>
@@ -7306,9 +7306,9 @@
                 <w:b w:val="0"/>
                 <w:sz w:val="19"/>
               </w:rPr>
-              <w:t>cyc</w:t>
+              <w:t>Chenyu Yang</w:t>
               <w:br/>
-              <w:t>Churchill</w:t>
+              <w:t>Songjie Qiu</w:t>
               <w:br/>
               <w:t>Estimate 3</w:t>
             </w:r>
@@ -7476,7 +7476,7 @@
               </w:rPr>
               <w:t>Xinran Zhang</w:t>
               <w:br/>
-              <w:t>Churchill</w:t>
+              <w:t>Songjie Qiu</w:t>
               <w:br/>
               <w:t>Estimate 7</w:t>
             </w:r>
@@ -7642,9 +7642,9 @@
                 <w:b w:val="0"/>
                 <w:sz w:val="19"/>
               </w:rPr>
-              <w:t>Churchill</w:t>
+              <w:t>Songjie Qiu</w:t>
               <w:br/>
-              <w:t>Cathleen</w:t>
+              <w:t>Cathleen Liu</w:t>
               <w:br/>
               <w:t>Estimate 7</w:t>
             </w:r>
@@ -7915,7 +7915,7 @@
                 <w:b w:val="0"/>
                 <w:sz w:val="19"/>
               </w:rPr>
-              <w:t>Xinran Zhang and Cathleen</w:t>
+              <w:t>Xinran Zhang and Cathleen Liu</w:t>
             </w:r>
           </w:p>
         </w:tc>
@@ -8013,7 +8013,7 @@
                 <w:b w:val="0"/>
                 <w:sz w:val="19"/>
               </w:rPr>
-              <w:t>Churchill with cyc</w:t>
+              <w:t>Songjie Qiu with Chenyu Yang</w:t>
             </w:r>
           </w:p>
         </w:tc>
@@ -8111,7 +8111,7 @@
                 <w:b w:val="0"/>
                 <w:sz w:val="19"/>
               </w:rPr>
-              <w:t>Xinran Zhang and Churchill</w:t>
+              <w:t>Xinran Zhang and Songjie Qiu</w:t>
             </w:r>
           </w:p>
         </w:tc>
@@ -8209,7 +8209,7 @@
                 <w:b w:val="0"/>
                 <w:sz w:val="19"/>
               </w:rPr>
-              <w:t>Churchill with cyc and Cathleen</w:t>
+              <w:t>Songjie Qiu with Chenyu Yang and Cathleen Liu</w:t>
             </w:r>
           </w:p>
         </w:tc>
@@ -8307,7 +8307,7 @@
                 <w:b w:val="0"/>
                 <w:sz w:val="19"/>
               </w:rPr>
-              <w:t>Churchill and Cathleen</w:t>
+              <w:t>Songjie Qiu and Cathleen Liu</w:t>
             </w:r>
           </w:p>
         </w:tc>
@@ -9227,7 +9227,7 @@
                 <w:b w:val="0"/>
                 <w:sz w:val="19"/>
               </w:rPr>
-              <w:t>Cathleen</w:t>
+              <w:t>Cathleen Liu</w:t>
             </w:r>
           </w:p>
         </w:tc>
@@ -9325,7 +9325,7 @@
                 <w:b w:val="0"/>
                 <w:sz w:val="19"/>
               </w:rPr>
-              <w:t>cyc</w:t>
+              <w:t>Chenyu Yang</w:t>
             </w:r>
           </w:p>
         </w:tc>
@@ -9423,7 +9423,7 @@
                 <w:b w:val="0"/>
                 <w:sz w:val="19"/>
               </w:rPr>
-              <w:t>Churchill</w:t>
+              <w:t>Songjie Qiu</w:t>
             </w:r>
           </w:p>
         </w:tc>
@@ -9699,8 +9699,431 @@
         <w:t>Remaining limits include role isolation, repeated-letter variable isolation, cloud Mock TLS and Connector inbound scanning. Connector execution is not written to the Java H2 event_log. The iStar source hash predates the SP05 adaptation and needs a traceability review; its internal clinical-support boundary remains a deliberate strategic revision.</w:t>
       </w:r>
     </w:p>
+    <w:p>
+      <w:r>
+        <w:br w:type="page"/>
+      </w:r>
+    </w:p>
+    <w:p>
+      <w:pPr>
+        <w:pStyle w:val="Heading1"/>
+      </w:pPr>
+      <w:r>
+        <w:t>Confirmed individual contributions</w:t>
+      </w:r>
+    </w:p>
+    <w:p>
+      <w:r>
+        <w:t>The team confirmed the following authorship on 20 October 2026. Each PB range covers the related BPMN, SD/SR models, Worker implementation and strategic model sections.</w:t>
+      </w:r>
+    </w:p>
+    <w:tbl>
+      <w:tblPr>
+        <w:tblW w:type="auto" w:w="0"/>
+        <w:jc w:val="center"/>
+        <w:tblLayout w:type="fixed"/>
+        <w:tblLook w:firstColumn="1" w:firstRow="1" w:lastColumn="0" w:lastRow="0" w:noHBand="0" w:noVBand="1" w:val="04A0"/>
+      </w:tblPr>
+      <w:tblGrid>
+        <w:gridCol w:w="3744"/>
+        <w:gridCol w:w="3024"/>
+        <w:gridCol w:w="2304"/>
+      </w:tblGrid>
+      <w:tr>
+        <w:tc>
+          <w:tcPr>
+            <w:tcW w:type="dxa" w:w="3408"/>
+            <w:vAlign w:val="center"/>
+            <w:tcBorders>
+              <w:top w:val="single" w:sz="4" w:color="D9D9D9"/>
+              <w:left w:val="single" w:sz="4" w:color="D9D9D9"/>
+              <w:bottom w:val="single" w:sz="4" w:color="D9D9D9"/>
+              <w:right w:val="single" w:sz="4" w:color="D9D9D9"/>
+            </w:tcBorders>
+            <w:shd w:fill="E7E6E6"/>
+          </w:tcPr>
+          <w:p>
+            <w:pPr>
+              <w:spacing w:before="120" w:after="120"/>
+            </w:pPr>
+            <w:r>
+              <w:rPr>
+                <w:b/>
+                <w:sz w:val="22"/>
+              </w:rPr>
+              <w:t>Student</w:t>
+            </w:r>
+          </w:p>
+        </w:tc>
+        <w:tc>
+          <w:tcPr>
+            <w:tcW w:type="dxa" w:w="3408"/>
+            <w:vAlign w:val="center"/>
+            <w:tcBorders>
+              <w:top w:val="single" w:sz="4" w:color="D9D9D9"/>
+              <w:left w:val="single" w:sz="4" w:color="D9D9D9"/>
+              <w:bottom w:val="single" w:sz="4" w:color="D9D9D9"/>
+              <w:right w:val="single" w:sz="4" w:color="D9D9D9"/>
+            </w:tcBorders>
+            <w:shd w:fill="E7E6E6"/>
+          </w:tcPr>
+          <w:p>
+            <w:pPr>
+              <w:spacing w:before="120" w:after="120"/>
+            </w:pPr>
+            <w:r>
+              <w:rPr>
+                <w:b/>
+                <w:sz w:val="22"/>
+              </w:rPr>
+              <w:t>Authored PB scope</w:t>
+            </w:r>
+          </w:p>
+        </w:tc>
+        <w:tc>
+          <w:tcPr>
+            <w:tcW w:type="dxa" w:w="3408"/>
+            <w:vAlign w:val="center"/>
+            <w:tcBorders>
+              <w:top w:val="single" w:sz="4" w:color="D9D9D9"/>
+              <w:left w:val="single" w:sz="4" w:color="D9D9D9"/>
+              <w:bottom w:val="single" w:sz="4" w:color="D9D9D9"/>
+              <w:right w:val="single" w:sz="4" w:color="D9D9D9"/>
+            </w:tcBorders>
+            <w:shd w:fill="E7E6E6"/>
+          </w:tcPr>
+          <w:p>
+            <w:pPr>
+              <w:spacing w:before="120" w:after="120"/>
+            </w:pPr>
+            <w:r>
+              <w:rPr>
+                <w:b/>
+                <w:sz w:val="22"/>
+              </w:rPr>
+              <w:t>Contribution</w:t>
+            </w:r>
+          </w:p>
+        </w:tc>
+      </w:tr>
+      <w:tr>
+        <w:tc>
+          <w:tcPr>
+            <w:tcW w:type="dxa" w:w="3744"/>
+            <w:vAlign w:val="center"/>
+            <w:tcBorders>
+              <w:top w:val="single" w:sz="4" w:color="D9D9D9"/>
+              <w:left w:val="single" w:sz="4" w:color="D9D9D9"/>
+              <w:bottom w:val="single" w:sz="4" w:color="D9D9D9"/>
+              <w:right w:val="single" w:sz="4" w:color="D9D9D9"/>
+            </w:tcBorders>
+          </w:tcPr>
+          <w:p>
+            <w:pPr>
+              <w:spacing w:before="120" w:after="120"/>
+            </w:pPr>
+            <w:r>
+              <w:rPr>
+                <w:b w:val="0"/>
+                <w:sz w:val="22"/>
+              </w:rPr>
+              <w:t>Xinran Zhang</w:t>
+              <w:br/>
+              <w:t>23084415</w:t>
+            </w:r>
+          </w:p>
+        </w:tc>
+        <w:tc>
+          <w:tcPr>
+            <w:tcW w:type="dxa" w:w="3024"/>
+            <w:vAlign w:val="center"/>
+            <w:tcBorders>
+              <w:top w:val="single" w:sz="4" w:color="D9D9D9"/>
+              <w:left w:val="single" w:sz="4" w:color="D9D9D9"/>
+              <w:bottom w:val="single" w:sz="4" w:color="D9D9D9"/>
+              <w:right w:val="single" w:sz="4" w:color="D9D9D9"/>
+            </w:tcBorders>
+          </w:tcPr>
+          <w:p>
+            <w:pPr>
+              <w:spacing w:before="120" w:after="120"/>
+            </w:pPr>
+            <w:r>
+              <w:rPr>
+                <w:b w:val="0"/>
+                <w:sz w:val="22"/>
+              </w:rPr>
+              <w:t>PB01-PB05</w:t>
+            </w:r>
+          </w:p>
+        </w:tc>
+        <w:tc>
+          <w:tcPr>
+            <w:tcW w:type="dxa" w:w="2304"/>
+            <w:vAlign w:val="center"/>
+            <w:tcBorders>
+              <w:top w:val="single" w:sz="4" w:color="D9D9D9"/>
+              <w:left w:val="single" w:sz="4" w:color="D9D9D9"/>
+              <w:bottom w:val="single" w:sz="4" w:color="D9D9D9"/>
+              <w:right w:val="single" w:sz="4" w:color="D9D9D9"/>
+            </w:tcBorders>
+          </w:tcPr>
+          <w:p>
+            <w:pPr>
+              <w:spacing w:before="120" w:after="120"/>
+            </w:pPr>
+            <w:r>
+              <w:rPr>
+                <w:b w:val="0"/>
+                <w:sz w:val="22"/>
+              </w:rPr>
+              <w:t>26%</w:t>
+            </w:r>
+          </w:p>
+        </w:tc>
+      </w:tr>
+      <w:tr>
+        <w:tc>
+          <w:tcPr>
+            <w:tcW w:type="dxa" w:w="3744"/>
+            <w:vAlign w:val="center"/>
+            <w:tcBorders>
+              <w:top w:val="single" w:sz="4" w:color="D9D9D9"/>
+              <w:left w:val="single" w:sz="4" w:color="D9D9D9"/>
+              <w:bottom w:val="single" w:sz="4" w:color="D9D9D9"/>
+              <w:right w:val="single" w:sz="4" w:color="D9D9D9"/>
+            </w:tcBorders>
+          </w:tcPr>
+          <w:p>
+            <w:pPr>
+              <w:spacing w:before="120" w:after="120"/>
+            </w:pPr>
+            <w:r>
+              <w:rPr>
+                <w:b w:val="0"/>
+                <w:sz w:val="22"/>
+              </w:rPr>
+              <w:t>Songjie Qiu</w:t>
+              <w:br/>
+              <w:t>23084419</w:t>
+            </w:r>
+          </w:p>
+        </w:tc>
+        <w:tc>
+          <w:tcPr>
+            <w:tcW w:type="dxa" w:w="3024"/>
+            <w:vAlign w:val="center"/>
+            <w:tcBorders>
+              <w:top w:val="single" w:sz="4" w:color="D9D9D9"/>
+              <w:left w:val="single" w:sz="4" w:color="D9D9D9"/>
+              <w:bottom w:val="single" w:sz="4" w:color="D9D9D9"/>
+              <w:right w:val="single" w:sz="4" w:color="D9D9D9"/>
+            </w:tcBorders>
+          </w:tcPr>
+          <w:p>
+            <w:pPr>
+              <w:spacing w:before="120" w:after="120"/>
+            </w:pPr>
+            <w:r>
+              <w:rPr>
+                <w:b w:val="0"/>
+                <w:sz w:val="22"/>
+              </w:rPr>
+              <w:t>PB09-PB13</w:t>
+            </w:r>
+          </w:p>
+        </w:tc>
+        <w:tc>
+          <w:tcPr>
+            <w:tcW w:type="dxa" w:w="2304"/>
+            <w:vAlign w:val="center"/>
+            <w:tcBorders>
+              <w:top w:val="single" w:sz="4" w:color="D9D9D9"/>
+              <w:left w:val="single" w:sz="4" w:color="D9D9D9"/>
+              <w:bottom w:val="single" w:sz="4" w:color="D9D9D9"/>
+              <w:right w:val="single" w:sz="4" w:color="D9D9D9"/>
+            </w:tcBorders>
+          </w:tcPr>
+          <w:p>
+            <w:pPr>
+              <w:spacing w:before="120" w:after="120"/>
+            </w:pPr>
+            <w:r>
+              <w:rPr>
+                <w:b w:val="0"/>
+                <w:sz w:val="22"/>
+              </w:rPr>
+              <w:t>26%</w:t>
+            </w:r>
+          </w:p>
+        </w:tc>
+      </w:tr>
+      <w:tr>
+        <w:tc>
+          <w:tcPr>
+            <w:tcW w:type="dxa" w:w="3744"/>
+            <w:vAlign w:val="center"/>
+            <w:tcBorders>
+              <w:top w:val="single" w:sz="4" w:color="D9D9D9"/>
+              <w:left w:val="single" w:sz="4" w:color="D9D9D9"/>
+              <w:bottom w:val="single" w:sz="4" w:color="D9D9D9"/>
+              <w:right w:val="single" w:sz="4" w:color="D9D9D9"/>
+            </w:tcBorders>
+          </w:tcPr>
+          <w:p>
+            <w:pPr>
+              <w:spacing w:before="120" w:after="120"/>
+            </w:pPr>
+            <w:r>
+              <w:rPr>
+                <w:b w:val="0"/>
+                <w:sz w:val="22"/>
+              </w:rPr>
+              <w:t>Chenyu Yang</w:t>
+              <w:br/>
+              <w:t>23084439</w:t>
+            </w:r>
+          </w:p>
+        </w:tc>
+        <w:tc>
+          <w:tcPr>
+            <w:tcW w:type="dxa" w:w="3024"/>
+            <w:vAlign w:val="center"/>
+            <w:tcBorders>
+              <w:top w:val="single" w:sz="4" w:color="D9D9D9"/>
+              <w:left w:val="single" w:sz="4" w:color="D9D9D9"/>
+              <w:bottom w:val="single" w:sz="4" w:color="D9D9D9"/>
+              <w:right w:val="single" w:sz="4" w:color="D9D9D9"/>
+            </w:tcBorders>
+          </w:tcPr>
+          <w:p>
+            <w:pPr>
+              <w:spacing w:before="120" w:after="120"/>
+            </w:pPr>
+            <w:r>
+              <w:rPr>
+                <w:b w:val="0"/>
+                <w:sz w:val="22"/>
+              </w:rPr>
+              <w:t>PB14-PB20</w:t>
+            </w:r>
+          </w:p>
+        </w:tc>
+        <w:tc>
+          <w:tcPr>
+            <w:tcW w:type="dxa" w:w="2304"/>
+            <w:vAlign w:val="center"/>
+            <w:tcBorders>
+              <w:top w:val="single" w:sz="4" w:color="D9D9D9"/>
+              <w:left w:val="single" w:sz="4" w:color="D9D9D9"/>
+              <w:bottom w:val="single" w:sz="4" w:color="D9D9D9"/>
+              <w:right w:val="single" w:sz="4" w:color="D9D9D9"/>
+            </w:tcBorders>
+          </w:tcPr>
+          <w:p>
+            <w:pPr>
+              <w:spacing w:before="120" w:after="120"/>
+            </w:pPr>
+            <w:r>
+              <w:rPr>
+                <w:b w:val="0"/>
+                <w:sz w:val="22"/>
+              </w:rPr>
+              <w:t>23%</w:t>
+            </w:r>
+          </w:p>
+        </w:tc>
+      </w:tr>
+      <w:tr>
+        <w:tc>
+          <w:tcPr>
+            <w:tcW w:type="dxa" w:w="3744"/>
+            <w:vAlign w:val="center"/>
+            <w:tcBorders>
+              <w:top w:val="single" w:sz="4" w:color="D9D9D9"/>
+              <w:left w:val="single" w:sz="4" w:color="D9D9D9"/>
+              <w:bottom w:val="single" w:sz="4" w:color="D9D9D9"/>
+              <w:right w:val="single" w:sz="4" w:color="D9D9D9"/>
+            </w:tcBorders>
+          </w:tcPr>
+          <w:p>
+            <w:pPr>
+              <w:spacing w:before="120" w:after="120"/>
+            </w:pPr>
+            <w:r>
+              <w:rPr>
+                <w:b w:val="0"/>
+                <w:sz w:val="22"/>
+              </w:rPr>
+              <w:t>Cathleen Liu</w:t>
+              <w:br/>
+              <w:t>23084383</w:t>
+            </w:r>
+          </w:p>
+        </w:tc>
+        <w:tc>
+          <w:tcPr>
+            <w:tcW w:type="dxa" w:w="3024"/>
+            <w:vAlign w:val="center"/>
+            <w:tcBorders>
+              <w:top w:val="single" w:sz="4" w:color="D9D9D9"/>
+              <w:left w:val="single" w:sz="4" w:color="D9D9D9"/>
+              <w:bottom w:val="single" w:sz="4" w:color="D9D9D9"/>
+              <w:right w:val="single" w:sz="4" w:color="D9D9D9"/>
+            </w:tcBorders>
+          </w:tcPr>
+          <w:p>
+            <w:pPr>
+              <w:spacing w:before="120" w:after="120"/>
+            </w:pPr>
+            <w:r>
+              <w:rPr>
+                <w:b w:val="0"/>
+                <w:sz w:val="22"/>
+              </w:rPr>
+              <w:t>PB06-PB08</w:t>
+            </w:r>
+          </w:p>
+        </w:tc>
+        <w:tc>
+          <w:tcPr>
+            <w:tcW w:type="dxa" w:w="2304"/>
+            <w:vAlign w:val="center"/>
+            <w:tcBorders>
+              <w:top w:val="single" w:sz="4" w:color="D9D9D9"/>
+              <w:left w:val="single" w:sz="4" w:color="D9D9D9"/>
+              <w:bottom w:val="single" w:sz="4" w:color="D9D9D9"/>
+              <w:right w:val="single" w:sz="4" w:color="D9D9D9"/>
+            </w:tcBorders>
+          </w:tcPr>
+          <w:p>
+            <w:pPr>
+              <w:spacing w:before="120" w:after="120"/>
+            </w:pPr>
+            <w:r>
+              <w:rPr>
+                <w:b w:val="0"/>
+                <w:sz w:val="22"/>
+              </w:rPr>
+              <w:t>25%</w:t>
+            </w:r>
+          </w:p>
+        </w:tc>
+      </w:tr>
+    </w:tbl>
+    <w:p>
+      <w:r>
+        <w:t>These ranges refer to PB01-PB20 in Part 3. The agreed contribution percentages total 100% and are not calculated from item counts or estimates.</w:t>
+      </w:r>
+    </w:p>
+    <w:p>
+      <w:r>
+        <w:t>The first-owner and second-owner assignments in Parts 3-7 remain the plan for review, fixes and handovers. They do not replace the authorship above. Authorship does not change the recorded acceptance results or imply that unresolved criteria have passed.</w:t>
+      </w:r>
+    </w:p>
     <w:sectPr>
       <w:footerReference w:type="default" r:id="rId9"/>
+      <w:headerReference w:type="default" r:id="rId10"/>
       <w:pgSz w:w="12240" w:h="15840"/>
       <w:pgMar w:top="936" w:right="1008" w:bottom="936" w:left="1008" w:header="360" w:footer="432" w:gutter="0"/>
       <w:cols w:space="720"/>
@@ -9726,6 +10149,16 @@
     <w:fldSimple w:instr="PAGE"/>
   </w:p>
 </w:ftr>
+</file>
+
+<file path=word/header1.xml><?xml version="1.0" encoding="utf-8"?>
+<w:hdr xmlns:m="http://schemas.openxmlformats.org/officeDocument/2006/math" xmlns:mc="http://schemas.openxmlformats.org/markup-compatibility/2006" xmlns:mo="http://schemas.microsoft.com/office/mac/office/2008/main" xmlns:mv="urn:schemas-microsoft-com:mac:vml" xmlns:o="urn:schemas-microsoft-com:office:office" xmlns:r="http://schemas.openxmlformats.org/officeDocument/2006/relationships" xmlns:v="urn:schemas-microsoft-com:vml" xmlns:w10="urn:schemas-microsoft-com:office:word" xmlns:w14="http://schemas.microsoft.com/office/word/2010/wordml" xmlns:w="http://schemas.openxmlformats.org/wordprocessingml/2006/main" xmlns:wne="http://schemas.microsoft.com/office/word/2006/wordml" xmlns:wp14="http://schemas.microsoft.com/office/word/2010/wordprocessingDrawing" xmlns:wp="http://schemas.openxmlformats.org/drawingml/2006/wordprocessingDrawing" xmlns:wpc="http://schemas.microsoft.com/office/word/2010/wordprocessingCanvas" xmlns:wpg="http://schemas.microsoft.com/office/word/2010/wordprocessingGroup" xmlns:wpi="http://schemas.microsoft.com/office/word/2010/wordprocessingInk" xmlns:wps="http://schemas.microsoft.com/office/word/2010/wordprocessingShape" mc:Ignorable="w14 wp14">
+  <w:p>
+    <w:pPr>
+      <w:pStyle w:val="Header"/>
+    </w:pPr>
+  </w:p>
+</w:hdr>
 </file>
 
 <file path=word/numbering.xml><?xml version="1.0" encoding="utf-8"?>

</xml_diff>

<commit_message>
chore: organize repository and detail contribution records (#6)
Co-authored-by: heavenyyy <13380669020@qq.com>
</commit_message>
<xml_diff>
--- a/version2/Agile Workshop.docx
+++ b/version2/Agile Workshop.docx
@@ -1444,7 +1444,7 @@
         <w:spacing w:after="60" w:line="240" w:lineRule="auto"/>
       </w:pPr>
       <w:r>
-        <w:t>Status describes repository evidence, not a claim that the named student completed the item. High priorities highlight acceptance gaps. Owners and estimates are retained; the team should confirm the revised priorities.</w:t>
+        <w:t>Status describes repository evidence. First and second owners are review/fix assignments, not original authors. Confirmed authorship by PB range is recorded in the final contribution section.</w:t>
       </w:r>
     </w:p>
     <w:p>
@@ -1469,7 +1469,7 @@
         <w:spacing w:after="60" w:line="240" w:lineRule="auto"/>
       </w:pPr>
       <w:r>
-        <w:t>Priority: High. Estimate: 3. First owner: Xinran Zhang. Second owner: Cathleen.</w:t>
+        <w:t>Priority: High. Estimate: 3. First owner: Xinran Zhang. Second owner: Cathleen Liu.</w:t>
       </w:r>
     </w:p>
     <w:p>
@@ -1524,7 +1524,7 @@
         <w:spacing w:after="60" w:line="240" w:lineRule="auto"/>
       </w:pPr>
       <w:r>
-        <w:t>Priority: High. Estimate: 5. First owner: Cathleen. Second owner: Xinran Zhang.</w:t>
+        <w:t>Priority: High. Estimate: 5. First owner: Cathleen Liu. Second owner: Xinran Zhang.</w:t>
       </w:r>
     </w:p>
     <w:p>
@@ -1579,7 +1579,7 @@
         <w:spacing w:after="60" w:line="240" w:lineRule="auto"/>
       </w:pPr>
       <w:r>
-        <w:t>Priority: High. Estimate: 5. First owner: Xinran Zhang. Second owner: cyc.</w:t>
+        <w:t>Priority: High. Estimate: 5. First owner: Xinran Zhang. Second owner: Chenyu Yang.</w:t>
       </w:r>
     </w:p>
     <w:p>
@@ -1634,7 +1634,7 @@
         <w:spacing w:after="60" w:line="240" w:lineRule="auto"/>
       </w:pPr>
       <w:r>
-        <w:t>Priority: High. Estimate: 7. First owner: Cathleen. Second owner: cyc.</w:t>
+        <w:t>Priority: High. Estimate: 7. First owner: Cathleen Liu. Second owner: Chenyu Yang.</w:t>
       </w:r>
     </w:p>
     <w:p>
@@ -1689,7 +1689,7 @@
         <w:spacing w:after="60" w:line="240" w:lineRule="auto"/>
       </w:pPr>
       <w:r>
-        <w:t>Priority: High. Estimate: 3. First owner: Xinran Zhang. Second owner: Churchill.</w:t>
+        <w:t>Priority: High. Estimate: 3. First owner: Xinran Zhang. Second owner: Songjie Qiu.</w:t>
       </w:r>
     </w:p>
     <w:p>
@@ -1757,7 +1757,7 @@
         <w:spacing w:after="60" w:line="240" w:lineRule="auto"/>
       </w:pPr>
       <w:r>
-        <w:t>Priority: High. Estimate: 7. First owner: Cathleen. Second owner: Xinran Zhang.</w:t>
+        <w:t>Priority: High. Estimate: 7. First owner: Cathleen Liu. Second owner: Xinran Zhang.</w:t>
       </w:r>
     </w:p>
     <w:p>
@@ -1812,7 +1812,7 @@
         <w:spacing w:after="60" w:line="240" w:lineRule="auto"/>
       </w:pPr>
       <w:r>
-        <w:t>Priority: High. Estimate: 5. First owner: Xinran Zhang. Second owner: Cathleen.</w:t>
+        <w:t>Priority: High. Estimate: 5. First owner: Xinran Zhang. Second owner: Cathleen Liu.</w:t>
       </w:r>
     </w:p>
     <w:p>
@@ -1867,7 +1867,7 @@
         <w:spacing w:after="60" w:line="240" w:lineRule="auto"/>
       </w:pPr>
       <w:r>
-        <w:t>Priority: High. Estimate: 3. First owner: cyc. Second owner: Xinran Zhang.</w:t>
+        <w:t>Priority: High. Estimate: 3. First owner: Chenyu Yang. Second owner: Xinran Zhang.</w:t>
       </w:r>
     </w:p>
     <w:p>
@@ -1922,7 +1922,7 @@
         <w:spacing w:after="60" w:line="240" w:lineRule="auto"/>
       </w:pPr>
       <w:r>
-        <w:t>Priority: Medium. Estimate: 3. First owner: cyc. Second owner: Churchill.</w:t>
+        <w:t>Priority: Medium. Estimate: 3. First owner: Chenyu Yang. Second owner: Songjie Qiu.</w:t>
       </w:r>
     </w:p>
     <w:p>
@@ -1977,7 +1977,7 @@
         <w:spacing w:after="60" w:line="240" w:lineRule="auto"/>
       </w:pPr>
       <w:r>
-        <w:t>Priority: High. Estimate: 3. First owner: Cathleen. Second owner: Churchill.</w:t>
+        <w:t>Priority: High. Estimate: 3. First owner: Cathleen Liu. Second owner: Songjie Qiu.</w:t>
       </w:r>
     </w:p>
     <w:p>
@@ -2045,7 +2045,7 @@
         <w:spacing w:after="60" w:line="240" w:lineRule="auto"/>
       </w:pPr>
       <w:r>
-        <w:t>Priority: High. Estimate: 7. First owner: Churchill. Second owner: Cathleen.</w:t>
+        <w:t>Priority: High. Estimate: 7. First owner: Songjie Qiu. Second owner: Cathleen Liu.</w:t>
       </w:r>
     </w:p>
     <w:p>
@@ -2100,7 +2100,7 @@
         <w:spacing w:after="60" w:line="240" w:lineRule="auto"/>
       </w:pPr>
       <w:r>
-        <w:t>Priority: High. Estimate: 7. First owner: Churchill. Second owner: cyc.</w:t>
+        <w:t>Priority: High. Estimate: 7. First owner: Songjie Qiu. Second owner: Chenyu Yang.</w:t>
       </w:r>
     </w:p>
     <w:p>
@@ -2155,7 +2155,7 @@
         <w:spacing w:after="60" w:line="240" w:lineRule="auto"/>
       </w:pPr>
       <w:r>
-        <w:t>Priority: Medium. Estimate: 3. First owner: cyc. Second owner: Churchill.</w:t>
+        <w:t>Priority: Medium. Estimate: 3. First owner: Chenyu Yang. Second owner: Songjie Qiu.</w:t>
       </w:r>
     </w:p>
     <w:p>
@@ -2210,7 +2210,7 @@
         <w:spacing w:after="60" w:line="240" w:lineRule="auto"/>
       </w:pPr>
       <w:r>
-        <w:t>Priority: Medium. Estimate: 5. First owner: Cathleen. Second owner: Xinran Zhang.</w:t>
+        <w:t>Priority: Medium. Estimate: 5. First owner: Cathleen Liu. Second owner: Xinran Zhang.</w:t>
       </w:r>
     </w:p>
     <w:p>
@@ -2265,7 +2265,7 @@
         <w:spacing w:after="60" w:line="240" w:lineRule="auto"/>
       </w:pPr>
       <w:r>
-        <w:t>Priority: Medium. Estimate: 7. First owner: Churchill. Second owner: Xinran Zhang.</w:t>
+        <w:t>Priority: Medium. Estimate: 7. First owner: Songjie Qiu. Second owner: Xinran Zhang.</w:t>
       </w:r>
     </w:p>
     <w:p>
@@ -2333,7 +2333,7 @@
         <w:spacing w:after="60" w:line="240" w:lineRule="auto"/>
       </w:pPr>
       <w:r>
-        <w:t>Priority: High. Estimate: 7. First owner: Xinran Zhang. Second owner: cyc.</w:t>
+        <w:t>Priority: High. Estimate: 7. First owner: Xinran Zhang. Second owner: Chenyu Yang.</w:t>
       </w:r>
     </w:p>
     <w:p>
@@ -2388,7 +2388,7 @@
         <w:spacing w:after="60" w:line="240" w:lineRule="auto"/>
       </w:pPr>
       <w:r>
-        <w:t>Priority: High. Estimate: 7. First owner: Churchill. Second owner: Cathleen.</w:t>
+        <w:t>Priority: High. Estimate: 7. First owner: Songjie Qiu. Second owner: Cathleen Liu.</w:t>
       </w:r>
     </w:p>
     <w:p>
@@ -2443,7 +2443,7 @@
         <w:spacing w:after="60" w:line="240" w:lineRule="auto"/>
       </w:pPr>
       <w:r>
-        <w:t>Priority: Medium. Estimate: 3. First owner: cyc. Second owner: Churchill.</w:t>
+        <w:t>Priority: Medium. Estimate: 3. First owner: Chenyu Yang. Second owner: Songjie Qiu.</w:t>
       </w:r>
     </w:p>
     <w:p>
@@ -2498,7 +2498,7 @@
         <w:spacing w:after="60" w:line="240" w:lineRule="auto"/>
       </w:pPr>
       <w:r>
-        <w:t>Priority: High. Estimate: 7. First owner: Xinran Zhang. Second owner: Churchill.</w:t>
+        <w:t>Priority: High. Estimate: 7. First owner: Xinran Zhang. Second owner: Songjie Qiu.</w:t>
       </w:r>
     </w:p>
     <w:p>
@@ -2553,7 +2553,7 @@
         <w:spacing w:after="60" w:line="240" w:lineRule="auto"/>
       </w:pPr>
       <w:r>
-        <w:t>Priority: High. Estimate: 7. First owner: Churchill. Second owner: Cathleen.</w:t>
+        <w:t>Priority: High. Estimate: 7. First owner: Songjie Qiu. Second owner: Cathleen Liu.</w:t>
       </w:r>
     </w:p>
     <w:p>
@@ -2878,7 +2878,7 @@
               </w:rPr>
               <w:t>Xinran Zhang</w:t>
               <w:br/>
-              <w:t>Cathleen</w:t>
+              <w:t>Cathleen Liu</w:t>
               <w:br/>
               <w:t>Estimate 3</w:t>
             </w:r>
@@ -3046,7 +3046,7 @@
               </w:rPr>
               <w:t>Xinran Zhang</w:t>
               <w:br/>
-              <w:t>Cathleen</w:t>
+              <w:t>Cathleen Liu</w:t>
               <w:br/>
               <w:t>Estimate 3</w:t>
             </w:r>
@@ -3212,7 +3212,7 @@
                 <w:b w:val="0"/>
                 <w:sz w:val="19"/>
               </w:rPr>
-              <w:t>Cathleen</w:t>
+              <w:t>Cathleen Liu</w:t>
               <w:br/>
               <w:t>Xinran Zhang</w:t>
               <w:br/>
@@ -3382,7 +3382,7 @@
               </w:rPr>
               <w:t>Xinran Zhang</w:t>
               <w:br/>
-              <w:t>cyc</w:t>
+              <w:t>Chenyu Yang</w:t>
               <w:br/>
               <w:t>Estimate 5</w:t>
             </w:r>
@@ -3548,9 +3548,9 @@
                 <w:b w:val="0"/>
                 <w:sz w:val="19"/>
               </w:rPr>
-              <w:t>Cathleen</w:t>
+              <w:t>Cathleen Liu</w:t>
               <w:br/>
-              <w:t>cyc</w:t>
+              <w:t>Chenyu Yang</w:t>
               <w:br/>
               <w:t>Estimate 5</w:t>
             </w:r>
@@ -3716,9 +3716,9 @@
                 <w:b w:val="0"/>
                 <w:sz w:val="19"/>
               </w:rPr>
-              <w:t>Cathleen</w:t>
+              <w:t>Cathleen Liu</w:t>
               <w:br/>
-              <w:t>cyc</w:t>
+              <w:t>Chenyu Yang</w:t>
               <w:br/>
               <w:t>Estimate 3</w:t>
             </w:r>
@@ -3886,7 +3886,7 @@
               </w:rPr>
               <w:t>Xinran Zhang</w:t>
               <w:br/>
-              <w:t>Churchill</w:t>
+              <w:t>Songjie Qiu</w:t>
               <w:br/>
               <w:t>Estimate 3</w:t>
             </w:r>
@@ -4052,7 +4052,7 @@
                 <w:b w:val="0"/>
                 <w:sz w:val="19"/>
               </w:rPr>
-              <w:t>Cathleen</w:t>
+              <w:t>Cathleen Liu</w:t>
               <w:br/>
               <w:t>Xinran Zhang</w:t>
               <w:br/>
@@ -4220,7 +4220,7 @@
                 <w:b w:val="0"/>
                 <w:sz w:val="19"/>
               </w:rPr>
-              <w:t>Cathleen</w:t>
+              <w:t>Cathleen Liu</w:t>
               <w:br/>
               <w:t>Xinran Zhang</w:t>
               <w:br/>
@@ -4589,7 +4589,7 @@
               </w:rPr>
               <w:t>Xinran Zhang</w:t>
               <w:br/>
-              <w:t>Cathleen</w:t>
+              <w:t>Cathleen Liu</w:t>
               <w:br/>
               <w:t>Estimate 5</w:t>
             </w:r>
@@ -4755,7 +4755,7 @@
                 <w:b w:val="0"/>
                 <w:sz w:val="19"/>
               </w:rPr>
-              <w:t>cyc</w:t>
+              <w:t>Chenyu Yang</w:t>
               <w:br/>
               <w:t>Xinran Zhang</w:t>
               <w:br/>
@@ -4923,9 +4923,9 @@
                 <w:b w:val="0"/>
                 <w:sz w:val="19"/>
               </w:rPr>
-              <w:t>cyc</w:t>
+              <w:t>Chenyu Yang</w:t>
               <w:br/>
-              <w:t>Churchill</w:t>
+              <w:t>Songjie Qiu</w:t>
               <w:br/>
               <w:t>Estimate 3</w:t>
             </w:r>
@@ -5091,9 +5091,9 @@
                 <w:b w:val="0"/>
                 <w:sz w:val="19"/>
               </w:rPr>
-              <w:t>Cathleen</w:t>
+              <w:t>Cathleen Liu</w:t>
               <w:br/>
-              <w:t>Churchill</w:t>
+              <w:t>Songjie Qiu</w:t>
               <w:br/>
               <w:t>Estimate 3</w:t>
             </w:r>
@@ -5259,9 +5259,9 @@
                 <w:b w:val="0"/>
                 <w:sz w:val="19"/>
               </w:rPr>
-              <w:t>Churchill</w:t>
+              <w:t>Songjie Qiu</w:t>
               <w:br/>
-              <w:t>Cathleen</w:t>
+              <w:t>Cathleen Liu</w:t>
               <w:br/>
               <w:t>Estimate 7</w:t>
             </w:r>
@@ -5427,9 +5427,9 @@
                 <w:b w:val="0"/>
                 <w:sz w:val="19"/>
               </w:rPr>
-              <w:t>Churchill</w:t>
+              <w:t>Songjie Qiu</w:t>
               <w:br/>
-              <w:t>cyc</w:t>
+              <w:t>Chenyu Yang</w:t>
               <w:br/>
               <w:t>Estimate 3</w:t>
             </w:r>
@@ -5595,9 +5595,9 @@
                 <w:b w:val="0"/>
                 <w:sz w:val="19"/>
               </w:rPr>
-              <w:t>Churchill</w:t>
+              <w:t>Songjie Qiu</w:t>
               <w:br/>
-              <w:t>cyc</w:t>
+              <w:t>Chenyu Yang</w:t>
               <w:br/>
               <w:t>Estimate 5</w:t>
             </w:r>
@@ -5763,9 +5763,9 @@
                 <w:b w:val="0"/>
                 <w:sz w:val="19"/>
               </w:rPr>
-              <w:t>cyc</w:t>
+              <w:t>Chenyu Yang</w:t>
               <w:br/>
-              <w:t>Churchill</w:t>
+              <w:t>Songjie Qiu</w:t>
               <w:br/>
               <w:t>Estimate 3</w:t>
             </w:r>
@@ -5931,7 +5931,7 @@
                 <w:b w:val="0"/>
                 <w:sz w:val="19"/>
               </w:rPr>
-              <w:t>Cathleen</w:t>
+              <w:t>Cathleen Liu</w:t>
               <w:br/>
               <w:t>Xinran Zhang</w:t>
               <w:br/>
@@ -6298,7 +6298,7 @@
                 <w:b w:val="0"/>
                 <w:sz w:val="19"/>
               </w:rPr>
-              <w:t>Churchill</w:t>
+              <w:t>Songjie Qiu</w:t>
               <w:br/>
               <w:t>Xinran Zhang</w:t>
               <w:br/>
@@ -6466,7 +6466,7 @@
                 <w:b w:val="0"/>
                 <w:sz w:val="19"/>
               </w:rPr>
-              <w:t>Churchill</w:t>
+              <w:t>Songjie Qiu</w:t>
               <w:br/>
               <w:t>Xinran Zhang</w:t>
               <w:br/>
@@ -6634,7 +6634,7 @@
                 <w:b w:val="0"/>
                 <w:sz w:val="19"/>
               </w:rPr>
-              <w:t>Churchill</w:t>
+              <w:t>Songjie Qiu</w:t>
               <w:br/>
               <w:t>Xinran Zhang</w:t>
               <w:br/>
@@ -6804,7 +6804,7 @@
               </w:rPr>
               <w:t>Xinran Zhang</w:t>
               <w:br/>
-              <w:t>cyc</w:t>
+              <w:t>Chenyu Yang</w:t>
               <w:br/>
               <w:t>Estimate 9</w:t>
             </w:r>
@@ -6970,9 +6970,9 @@
                 <w:b w:val="0"/>
                 <w:sz w:val="19"/>
               </w:rPr>
-              <w:t>Churchill</w:t>
+              <w:t>Songjie Qiu</w:t>
               <w:br/>
-              <w:t>Cathleen</w:t>
+              <w:t>Cathleen Liu</w:t>
               <w:br/>
               <w:t>Estimate 5</w:t>
             </w:r>
@@ -7138,9 +7138,9 @@
                 <w:b w:val="0"/>
                 <w:sz w:val="19"/>
               </w:rPr>
-              <w:t>Churchill</w:t>
+              <w:t>Songjie Qiu</w:t>
               <w:br/>
-              <w:t>Cathleen</w:t>
+              <w:t>Cathleen Liu</w:t>
               <w:br/>
               <w:t>Estimate 7</w:t>
             </w:r>
@@ -7306,9 +7306,9 @@
                 <w:b w:val="0"/>
                 <w:sz w:val="19"/>
               </w:rPr>
-              <w:t>cyc</w:t>
+              <w:t>Chenyu Yang</w:t>
               <w:br/>
-              <w:t>Churchill</w:t>
+              <w:t>Songjie Qiu</w:t>
               <w:br/>
               <w:t>Estimate 3</w:t>
             </w:r>
@@ -7476,7 +7476,7 @@
               </w:rPr>
               <w:t>Xinran Zhang</w:t>
               <w:br/>
-              <w:t>Churchill</w:t>
+              <w:t>Songjie Qiu</w:t>
               <w:br/>
               <w:t>Estimate 7</w:t>
             </w:r>
@@ -7642,9 +7642,9 @@
                 <w:b w:val="0"/>
                 <w:sz w:val="19"/>
               </w:rPr>
-              <w:t>Churchill</w:t>
+              <w:t>Songjie Qiu</w:t>
               <w:br/>
-              <w:t>Cathleen</w:t>
+              <w:t>Cathleen Liu</w:t>
               <w:br/>
               <w:t>Estimate 7</w:t>
             </w:r>
@@ -7915,7 +7915,7 @@
                 <w:b w:val="0"/>
                 <w:sz w:val="19"/>
               </w:rPr>
-              <w:t>Xinran Zhang and Cathleen</w:t>
+              <w:t>Xinran Zhang and Cathleen Liu</w:t>
             </w:r>
           </w:p>
         </w:tc>
@@ -8013,7 +8013,7 @@
                 <w:b w:val="0"/>
                 <w:sz w:val="19"/>
               </w:rPr>
-              <w:t>Churchill with cyc</w:t>
+              <w:t>Songjie Qiu with Chenyu Yang</w:t>
             </w:r>
           </w:p>
         </w:tc>
@@ -8111,7 +8111,7 @@
                 <w:b w:val="0"/>
                 <w:sz w:val="19"/>
               </w:rPr>
-              <w:t>Xinran Zhang and Churchill</w:t>
+              <w:t>Xinran Zhang and Songjie Qiu</w:t>
             </w:r>
           </w:p>
         </w:tc>
@@ -8209,7 +8209,7 @@
                 <w:b w:val="0"/>
                 <w:sz w:val="19"/>
               </w:rPr>
-              <w:t>Churchill with cyc and Cathleen</w:t>
+              <w:t>Songjie Qiu with Chenyu Yang and Cathleen Liu</w:t>
             </w:r>
           </w:p>
         </w:tc>
@@ -8307,7 +8307,7 @@
                 <w:b w:val="0"/>
                 <w:sz w:val="19"/>
               </w:rPr>
-              <w:t>Churchill and Cathleen</w:t>
+              <w:t>Songjie Qiu and Cathleen Liu</w:t>
             </w:r>
           </w:p>
         </w:tc>
@@ -9227,7 +9227,7 @@
                 <w:b w:val="0"/>
                 <w:sz w:val="19"/>
               </w:rPr>
-              <w:t>Cathleen</w:t>
+              <w:t>Cathleen Liu</w:t>
             </w:r>
           </w:p>
         </w:tc>
@@ -9325,7 +9325,7 @@
                 <w:b w:val="0"/>
                 <w:sz w:val="19"/>
               </w:rPr>
-              <w:t>cyc</w:t>
+              <w:t>Chenyu Yang</w:t>
             </w:r>
           </w:p>
         </w:tc>
@@ -9423,7 +9423,7 @@
                 <w:b w:val="0"/>
                 <w:sz w:val="19"/>
               </w:rPr>
-              <w:t>Churchill</w:t>
+              <w:t>Songjie Qiu</w:t>
             </w:r>
           </w:p>
         </w:tc>
@@ -9699,8 +9699,431 @@
         <w:t>Remaining limits include role isolation, repeated-letter variable isolation, cloud Mock TLS and Connector inbound scanning. Connector execution is not written to the Java H2 event_log. The iStar source hash predates the SP05 adaptation and needs a traceability review; its internal clinical-support boundary remains a deliberate strategic revision.</w:t>
       </w:r>
     </w:p>
+    <w:p>
+      <w:r>
+        <w:br w:type="page"/>
+      </w:r>
+    </w:p>
+    <w:p>
+      <w:pPr>
+        <w:pStyle w:val="Heading1"/>
+      </w:pPr>
+      <w:r>
+        <w:t>Confirmed individual contributions</w:t>
+      </w:r>
+    </w:p>
+    <w:p>
+      <w:r>
+        <w:t>The team confirmed the following authorship on 20 October 2026. Each PB range covers the related BPMN, SD/SR models, Worker implementation and strategic model sections.</w:t>
+      </w:r>
+    </w:p>
+    <w:tbl>
+      <w:tblPr>
+        <w:tblW w:type="auto" w:w="0"/>
+        <w:jc w:val="center"/>
+        <w:tblLayout w:type="fixed"/>
+        <w:tblLook w:firstColumn="1" w:firstRow="1" w:lastColumn="0" w:lastRow="0" w:noHBand="0" w:noVBand="1" w:val="04A0"/>
+      </w:tblPr>
+      <w:tblGrid>
+        <w:gridCol w:w="3744"/>
+        <w:gridCol w:w="3024"/>
+        <w:gridCol w:w="2304"/>
+      </w:tblGrid>
+      <w:tr>
+        <w:tc>
+          <w:tcPr>
+            <w:tcW w:type="dxa" w:w="3408"/>
+            <w:vAlign w:val="center"/>
+            <w:tcBorders>
+              <w:top w:val="single" w:sz="4" w:color="D9D9D9"/>
+              <w:left w:val="single" w:sz="4" w:color="D9D9D9"/>
+              <w:bottom w:val="single" w:sz="4" w:color="D9D9D9"/>
+              <w:right w:val="single" w:sz="4" w:color="D9D9D9"/>
+            </w:tcBorders>
+            <w:shd w:fill="E7E6E6"/>
+          </w:tcPr>
+          <w:p>
+            <w:pPr>
+              <w:spacing w:before="120" w:after="120"/>
+            </w:pPr>
+            <w:r>
+              <w:rPr>
+                <w:b/>
+                <w:sz w:val="22"/>
+              </w:rPr>
+              <w:t>Student</w:t>
+            </w:r>
+          </w:p>
+        </w:tc>
+        <w:tc>
+          <w:tcPr>
+            <w:tcW w:type="dxa" w:w="3408"/>
+            <w:vAlign w:val="center"/>
+            <w:tcBorders>
+              <w:top w:val="single" w:sz="4" w:color="D9D9D9"/>
+              <w:left w:val="single" w:sz="4" w:color="D9D9D9"/>
+              <w:bottom w:val="single" w:sz="4" w:color="D9D9D9"/>
+              <w:right w:val="single" w:sz="4" w:color="D9D9D9"/>
+            </w:tcBorders>
+            <w:shd w:fill="E7E6E6"/>
+          </w:tcPr>
+          <w:p>
+            <w:pPr>
+              <w:spacing w:before="120" w:after="120"/>
+            </w:pPr>
+            <w:r>
+              <w:rPr>
+                <w:b/>
+                <w:sz w:val="22"/>
+              </w:rPr>
+              <w:t>Authored PB scope</w:t>
+            </w:r>
+          </w:p>
+        </w:tc>
+        <w:tc>
+          <w:tcPr>
+            <w:tcW w:type="dxa" w:w="3408"/>
+            <w:vAlign w:val="center"/>
+            <w:tcBorders>
+              <w:top w:val="single" w:sz="4" w:color="D9D9D9"/>
+              <w:left w:val="single" w:sz="4" w:color="D9D9D9"/>
+              <w:bottom w:val="single" w:sz="4" w:color="D9D9D9"/>
+              <w:right w:val="single" w:sz="4" w:color="D9D9D9"/>
+            </w:tcBorders>
+            <w:shd w:fill="E7E6E6"/>
+          </w:tcPr>
+          <w:p>
+            <w:pPr>
+              <w:spacing w:before="120" w:after="120"/>
+            </w:pPr>
+            <w:r>
+              <w:rPr>
+                <w:b/>
+                <w:sz w:val="22"/>
+              </w:rPr>
+              <w:t>Contribution</w:t>
+            </w:r>
+          </w:p>
+        </w:tc>
+      </w:tr>
+      <w:tr>
+        <w:tc>
+          <w:tcPr>
+            <w:tcW w:type="dxa" w:w="3744"/>
+            <w:vAlign w:val="center"/>
+            <w:tcBorders>
+              <w:top w:val="single" w:sz="4" w:color="D9D9D9"/>
+              <w:left w:val="single" w:sz="4" w:color="D9D9D9"/>
+              <w:bottom w:val="single" w:sz="4" w:color="D9D9D9"/>
+              <w:right w:val="single" w:sz="4" w:color="D9D9D9"/>
+            </w:tcBorders>
+          </w:tcPr>
+          <w:p>
+            <w:pPr>
+              <w:spacing w:before="120" w:after="120"/>
+            </w:pPr>
+            <w:r>
+              <w:rPr>
+                <w:b w:val="0"/>
+                <w:sz w:val="22"/>
+              </w:rPr>
+              <w:t>Xinran Zhang</w:t>
+              <w:br/>
+              <w:t>23084415</w:t>
+            </w:r>
+          </w:p>
+        </w:tc>
+        <w:tc>
+          <w:tcPr>
+            <w:tcW w:type="dxa" w:w="3024"/>
+            <w:vAlign w:val="center"/>
+            <w:tcBorders>
+              <w:top w:val="single" w:sz="4" w:color="D9D9D9"/>
+              <w:left w:val="single" w:sz="4" w:color="D9D9D9"/>
+              <w:bottom w:val="single" w:sz="4" w:color="D9D9D9"/>
+              <w:right w:val="single" w:sz="4" w:color="D9D9D9"/>
+            </w:tcBorders>
+          </w:tcPr>
+          <w:p>
+            <w:pPr>
+              <w:spacing w:before="120" w:after="120"/>
+            </w:pPr>
+            <w:r>
+              <w:rPr>
+                <w:b w:val="0"/>
+                <w:sz w:val="22"/>
+              </w:rPr>
+              <w:t>PB01-PB05</w:t>
+            </w:r>
+          </w:p>
+        </w:tc>
+        <w:tc>
+          <w:tcPr>
+            <w:tcW w:type="dxa" w:w="2304"/>
+            <w:vAlign w:val="center"/>
+            <w:tcBorders>
+              <w:top w:val="single" w:sz="4" w:color="D9D9D9"/>
+              <w:left w:val="single" w:sz="4" w:color="D9D9D9"/>
+              <w:bottom w:val="single" w:sz="4" w:color="D9D9D9"/>
+              <w:right w:val="single" w:sz="4" w:color="D9D9D9"/>
+            </w:tcBorders>
+          </w:tcPr>
+          <w:p>
+            <w:pPr>
+              <w:spacing w:before="120" w:after="120"/>
+            </w:pPr>
+            <w:r>
+              <w:rPr>
+                <w:b w:val="0"/>
+                <w:sz w:val="22"/>
+              </w:rPr>
+              <w:t>26%</w:t>
+            </w:r>
+          </w:p>
+        </w:tc>
+      </w:tr>
+      <w:tr>
+        <w:tc>
+          <w:tcPr>
+            <w:tcW w:type="dxa" w:w="3744"/>
+            <w:vAlign w:val="center"/>
+            <w:tcBorders>
+              <w:top w:val="single" w:sz="4" w:color="D9D9D9"/>
+              <w:left w:val="single" w:sz="4" w:color="D9D9D9"/>
+              <w:bottom w:val="single" w:sz="4" w:color="D9D9D9"/>
+              <w:right w:val="single" w:sz="4" w:color="D9D9D9"/>
+            </w:tcBorders>
+          </w:tcPr>
+          <w:p>
+            <w:pPr>
+              <w:spacing w:before="120" w:after="120"/>
+            </w:pPr>
+            <w:r>
+              <w:rPr>
+                <w:b w:val="0"/>
+                <w:sz w:val="22"/>
+              </w:rPr>
+              <w:t>Songjie Qiu</w:t>
+              <w:br/>
+              <w:t>23084419</w:t>
+            </w:r>
+          </w:p>
+        </w:tc>
+        <w:tc>
+          <w:tcPr>
+            <w:tcW w:type="dxa" w:w="3024"/>
+            <w:vAlign w:val="center"/>
+            <w:tcBorders>
+              <w:top w:val="single" w:sz="4" w:color="D9D9D9"/>
+              <w:left w:val="single" w:sz="4" w:color="D9D9D9"/>
+              <w:bottom w:val="single" w:sz="4" w:color="D9D9D9"/>
+              <w:right w:val="single" w:sz="4" w:color="D9D9D9"/>
+            </w:tcBorders>
+          </w:tcPr>
+          <w:p>
+            <w:pPr>
+              <w:spacing w:before="120" w:after="120"/>
+            </w:pPr>
+            <w:r>
+              <w:rPr>
+                <w:b w:val="0"/>
+                <w:sz w:val="22"/>
+              </w:rPr>
+              <w:t>PB09-PB13</w:t>
+            </w:r>
+          </w:p>
+        </w:tc>
+        <w:tc>
+          <w:tcPr>
+            <w:tcW w:type="dxa" w:w="2304"/>
+            <w:vAlign w:val="center"/>
+            <w:tcBorders>
+              <w:top w:val="single" w:sz="4" w:color="D9D9D9"/>
+              <w:left w:val="single" w:sz="4" w:color="D9D9D9"/>
+              <w:bottom w:val="single" w:sz="4" w:color="D9D9D9"/>
+              <w:right w:val="single" w:sz="4" w:color="D9D9D9"/>
+            </w:tcBorders>
+          </w:tcPr>
+          <w:p>
+            <w:pPr>
+              <w:spacing w:before="120" w:after="120"/>
+            </w:pPr>
+            <w:r>
+              <w:rPr>
+                <w:b w:val="0"/>
+                <w:sz w:val="22"/>
+              </w:rPr>
+              <w:t>26%</w:t>
+            </w:r>
+          </w:p>
+        </w:tc>
+      </w:tr>
+      <w:tr>
+        <w:tc>
+          <w:tcPr>
+            <w:tcW w:type="dxa" w:w="3744"/>
+            <w:vAlign w:val="center"/>
+            <w:tcBorders>
+              <w:top w:val="single" w:sz="4" w:color="D9D9D9"/>
+              <w:left w:val="single" w:sz="4" w:color="D9D9D9"/>
+              <w:bottom w:val="single" w:sz="4" w:color="D9D9D9"/>
+              <w:right w:val="single" w:sz="4" w:color="D9D9D9"/>
+            </w:tcBorders>
+          </w:tcPr>
+          <w:p>
+            <w:pPr>
+              <w:spacing w:before="120" w:after="120"/>
+            </w:pPr>
+            <w:r>
+              <w:rPr>
+                <w:b w:val="0"/>
+                <w:sz w:val="22"/>
+              </w:rPr>
+              <w:t>Chenyu Yang</w:t>
+              <w:br/>
+              <w:t>23084439</w:t>
+            </w:r>
+          </w:p>
+        </w:tc>
+        <w:tc>
+          <w:tcPr>
+            <w:tcW w:type="dxa" w:w="3024"/>
+            <w:vAlign w:val="center"/>
+            <w:tcBorders>
+              <w:top w:val="single" w:sz="4" w:color="D9D9D9"/>
+              <w:left w:val="single" w:sz="4" w:color="D9D9D9"/>
+              <w:bottom w:val="single" w:sz="4" w:color="D9D9D9"/>
+              <w:right w:val="single" w:sz="4" w:color="D9D9D9"/>
+            </w:tcBorders>
+          </w:tcPr>
+          <w:p>
+            <w:pPr>
+              <w:spacing w:before="120" w:after="120"/>
+            </w:pPr>
+            <w:r>
+              <w:rPr>
+                <w:b w:val="0"/>
+                <w:sz w:val="22"/>
+              </w:rPr>
+              <w:t>PB14-PB20</w:t>
+            </w:r>
+          </w:p>
+        </w:tc>
+        <w:tc>
+          <w:tcPr>
+            <w:tcW w:type="dxa" w:w="2304"/>
+            <w:vAlign w:val="center"/>
+            <w:tcBorders>
+              <w:top w:val="single" w:sz="4" w:color="D9D9D9"/>
+              <w:left w:val="single" w:sz="4" w:color="D9D9D9"/>
+              <w:bottom w:val="single" w:sz="4" w:color="D9D9D9"/>
+              <w:right w:val="single" w:sz="4" w:color="D9D9D9"/>
+            </w:tcBorders>
+          </w:tcPr>
+          <w:p>
+            <w:pPr>
+              <w:spacing w:before="120" w:after="120"/>
+            </w:pPr>
+            <w:r>
+              <w:rPr>
+                <w:b w:val="0"/>
+                <w:sz w:val="22"/>
+              </w:rPr>
+              <w:t>23%</w:t>
+            </w:r>
+          </w:p>
+        </w:tc>
+      </w:tr>
+      <w:tr>
+        <w:tc>
+          <w:tcPr>
+            <w:tcW w:type="dxa" w:w="3744"/>
+            <w:vAlign w:val="center"/>
+            <w:tcBorders>
+              <w:top w:val="single" w:sz="4" w:color="D9D9D9"/>
+              <w:left w:val="single" w:sz="4" w:color="D9D9D9"/>
+              <w:bottom w:val="single" w:sz="4" w:color="D9D9D9"/>
+              <w:right w:val="single" w:sz="4" w:color="D9D9D9"/>
+            </w:tcBorders>
+          </w:tcPr>
+          <w:p>
+            <w:pPr>
+              <w:spacing w:before="120" w:after="120"/>
+            </w:pPr>
+            <w:r>
+              <w:rPr>
+                <w:b w:val="0"/>
+                <w:sz w:val="22"/>
+              </w:rPr>
+              <w:t>Cathleen Liu</w:t>
+              <w:br/>
+              <w:t>23084383</w:t>
+            </w:r>
+          </w:p>
+        </w:tc>
+        <w:tc>
+          <w:tcPr>
+            <w:tcW w:type="dxa" w:w="3024"/>
+            <w:vAlign w:val="center"/>
+            <w:tcBorders>
+              <w:top w:val="single" w:sz="4" w:color="D9D9D9"/>
+              <w:left w:val="single" w:sz="4" w:color="D9D9D9"/>
+              <w:bottom w:val="single" w:sz="4" w:color="D9D9D9"/>
+              <w:right w:val="single" w:sz="4" w:color="D9D9D9"/>
+            </w:tcBorders>
+          </w:tcPr>
+          <w:p>
+            <w:pPr>
+              <w:spacing w:before="120" w:after="120"/>
+            </w:pPr>
+            <w:r>
+              <w:rPr>
+                <w:b w:val="0"/>
+                <w:sz w:val="22"/>
+              </w:rPr>
+              <w:t>PB06-PB08</w:t>
+            </w:r>
+          </w:p>
+        </w:tc>
+        <w:tc>
+          <w:tcPr>
+            <w:tcW w:type="dxa" w:w="2304"/>
+            <w:vAlign w:val="center"/>
+            <w:tcBorders>
+              <w:top w:val="single" w:sz="4" w:color="D9D9D9"/>
+              <w:left w:val="single" w:sz="4" w:color="D9D9D9"/>
+              <w:bottom w:val="single" w:sz="4" w:color="D9D9D9"/>
+              <w:right w:val="single" w:sz="4" w:color="D9D9D9"/>
+            </w:tcBorders>
+          </w:tcPr>
+          <w:p>
+            <w:pPr>
+              <w:spacing w:before="120" w:after="120"/>
+            </w:pPr>
+            <w:r>
+              <w:rPr>
+                <w:b w:val="0"/>
+                <w:sz w:val="22"/>
+              </w:rPr>
+              <w:t>25%</w:t>
+            </w:r>
+          </w:p>
+        </w:tc>
+      </w:tr>
+    </w:tbl>
+    <w:p>
+      <w:r>
+        <w:t>These ranges refer to PB01-PB20 in Part 3. The agreed contribution percentages total 100% and are not calculated from item counts or estimates.</w:t>
+      </w:r>
+    </w:p>
+    <w:p>
+      <w:r>
+        <w:t>The first-owner and second-owner assignments in Parts 3-7 remain the plan for review, fixes and handovers. They do not replace the authorship above. Authorship does not change the recorded acceptance results or imply that unresolved criteria have passed.</w:t>
+      </w:r>
+    </w:p>
     <w:sectPr>
       <w:footerReference w:type="default" r:id="rId9"/>
+      <w:headerReference w:type="default" r:id="rId10"/>
       <w:pgSz w:w="12240" w:h="15840"/>
       <w:pgMar w:top="936" w:right="1008" w:bottom="936" w:left="1008" w:header="360" w:footer="432" w:gutter="0"/>
       <w:cols w:space="720"/>
@@ -9726,6 +10149,16 @@
     <w:fldSimple w:instr="PAGE"/>
   </w:p>
 </w:ftr>
+</file>
+
+<file path=word/header1.xml><?xml version="1.0" encoding="utf-8"?>
+<w:hdr xmlns:m="http://schemas.openxmlformats.org/officeDocument/2006/math" xmlns:mc="http://schemas.openxmlformats.org/markup-compatibility/2006" xmlns:mo="http://schemas.microsoft.com/office/mac/office/2008/main" xmlns:mv="urn:schemas-microsoft-com:mac:vml" xmlns:o="urn:schemas-microsoft-com:office:office" xmlns:r="http://schemas.openxmlformats.org/officeDocument/2006/relationships" xmlns:v="urn:schemas-microsoft-com:vml" xmlns:w10="urn:schemas-microsoft-com:office:word" xmlns:w14="http://schemas.microsoft.com/office/word/2010/wordml" xmlns:w="http://schemas.openxmlformats.org/wordprocessingml/2006/main" xmlns:wne="http://schemas.microsoft.com/office/word/2006/wordml" xmlns:wp14="http://schemas.microsoft.com/office/word/2010/wordprocessingDrawing" xmlns:wp="http://schemas.openxmlformats.org/drawingml/2006/wordprocessingDrawing" xmlns:wpc="http://schemas.microsoft.com/office/word/2010/wordprocessingCanvas" xmlns:wpg="http://schemas.microsoft.com/office/word/2010/wordprocessingGroup" xmlns:wpi="http://schemas.microsoft.com/office/word/2010/wordprocessingInk" xmlns:wps="http://schemas.microsoft.com/office/word/2010/wordprocessingShape" mc:Ignorable="w14 wp14">
+  <w:p>
+    <w:pPr>
+      <w:pStyle w:val="Header"/>
+    </w:pPr>
+  </w:p>
+</w:hdr>
 </file>
 
 <file path=word/numbering.xml><?xml version="1.0" encoding="utf-8"?>

</xml_diff>

<commit_message>
docs: map contributions to the 16 business activities
</commit_message>
<xml_diff>
--- a/version2/Agile Workshop.docx
+++ b/version2/Agile Workshop.docx
@@ -1444,7 +1444,7 @@
         <w:spacing w:after="60" w:line="240" w:lineRule="auto"/>
       </w:pPr>
       <w:r>
-        <w:t>Status describes repository evidence. First and second owners are review/fix assignments, not original authors. Confirmed authorship by PB range is recorded in the final contribution section.</w:t>
+        <w:t>Status describes repository evidence. First and second owners are review/fix assignments. Confirmed authorship follows the 16 case-study business activities in the final contribution section.</w:t>
       </w:r>
     </w:p>
     <w:p>
@@ -9714,7 +9714,7 @@
     </w:p>
     <w:p>
       <w:r>
-        <w:t>The team confirmed the following authorship on 20 October 2026. Each PB range covers the related BPMN, SD/SR models, Worker implementation and strategic model sections.</w:t>
+        <w:t>The team confirmed the authorship below on 20 October 2026. It covers BPMN, SD/SR, Worker implementation and strategic-model portions for the 16 numbered business activities in the case study.</w:t>
       </w:r>
     </w:p>
     <w:tbl>
@@ -9776,7 +9776,7 @@
                 <w:b/>
                 <w:sz w:val="22"/>
               </w:rPr>
-              <w:t>Authored PB scope</w:t>
+              <w:t>Business activities</w:t>
             </w:r>
           </w:p>
         </w:tc>
@@ -9853,7 +9853,7 @@
                 <w:b w:val="0"/>
                 <w:sz w:val="22"/>
               </w:rPr>
-              <w:t>PB01-PB05</w:t>
+              <w:t>Activities 1-5</w:t>
             </w:r>
           </w:p>
         </w:tc>
@@ -9929,7 +9929,7 @@
                 <w:b w:val="0"/>
                 <w:sz w:val="22"/>
               </w:rPr>
-              <w:t>PB09-PB13</w:t>
+              <w:t>Activities 9-13</w:t>
             </w:r>
           </w:p>
         </w:tc>
@@ -10005,7 +10005,7 @@
                 <w:b w:val="0"/>
                 <w:sz w:val="22"/>
               </w:rPr>
-              <w:t>PB14-PB20</w:t>
+              <w:t>Activities 14-16</w:t>
             </w:r>
           </w:p>
         </w:tc>
@@ -10081,7 +10081,7 @@
                 <w:b w:val="0"/>
                 <w:sz w:val="22"/>
               </w:rPr>
-              <w:t>PB06-PB08</w:t>
+              <w:t>Activities 6-8</w:t>
             </w:r>
           </w:p>
         </w:tc>
@@ -10113,12 +10113,238 @@
     </w:tbl>
     <w:p>
       <w:r>
-        <w:t>These ranges refer to PB01-PB20 in Part 3. The agreed contribution percentages total 100% and are not calculated from item counts or estimates.</w:t>
+        <w:t>These ranges refer to business activities 1-16, listed on the following page, rather than the Workshop product backlog PB01-PB20. The agreed percentages total 100% and are not calculated from activity counts or estimates.</w:t>
       </w:r>
     </w:p>
     <w:p>
       <w:r>
         <w:t>The first-owner and second-owner assignments in Parts 3-7 remain the plan for review, fixes and handovers. They do not replace the authorship above. Authorship does not change the recorded acceptance results or imply that unresolved criteria have passed.</w:t>
+      </w:r>
+    </w:p>
+    <w:p>
+      <w:r>
+        <w:br w:type="page"/>
+      </w:r>
+    </w:p>
+    <w:p>
+      <w:pPr>
+        <w:pStyle w:val="Heading1"/>
+      </w:pPr>
+      <w:r>
+        <w:t>Business activities and authorship</w:t>
+      </w:r>
+    </w:p>
+    <w:p>
+      <w:r>
+        <w:t>Each named author wrote the related BPMN, SD/SR, Worker implementation and strategic-model portions for the activities below.</w:t>
+      </w:r>
+    </w:p>
+    <w:p>
+      <w:pPr>
+        <w:pStyle w:val="Heading2"/>
+      </w:pPr>
+      <w:r>
+        <w:t>Xinran Zhang activities 1 to 5</w:t>
+      </w:r>
+    </w:p>
+    <w:p>
+      <w:pPr>
+        <w:spacing w:after="80"/>
+      </w:pPr>
+      <w:r>
+        <w:rPr>
+          <w:sz w:val="20"/>
+        </w:rPr>
+        <w:t>1. Receive referrals, check supporting documents and request missing information.</w:t>
+      </w:r>
+    </w:p>
+    <w:p>
+      <w:pPr>
+        <w:spacing w:after="80"/>
+      </w:pPr>
+      <w:r>
+        <w:rPr>
+          <w:sz w:val="20"/>
+        </w:rPr>
+        <w:t>2. Review referrals clinically and accept, reject, redirect or request more information.</w:t>
+      </w:r>
+    </w:p>
+    <w:p>
+      <w:pPr>
+        <w:spacing w:after="80"/>
+      </w:pPr>
+      <w:r>
+        <w:rPr>
+          <w:sz w:val="20"/>
+        </w:rPr>
+        <w:t>3. Book new-patient appointments, contact patients and record contact outcomes.</w:t>
+      </w:r>
+    </w:p>
+    <w:p>
+      <w:pPr>
+        <w:spacing w:after="80"/>
+      </w:pPr>
+      <w:r>
+        <w:rPr>
+          <w:sz w:val="20"/>
+        </w:rPr>
+        <w:t>4. Conduct consultations, diagnose, discuss treatment, record consent and authorise treatment requests.</w:t>
+      </w:r>
+    </w:p>
+    <w:p>
+      <w:pPr>
+        <w:spacing w:after="80"/>
+      </w:pPr>
+      <w:r>
+        <w:rPr>
+          <w:sz w:val="20"/>
+        </w:rPr>
+        <w:t>5. Coordinate treatment and chemotherapy bookings, resources and external services.</w:t>
+      </w:r>
+    </w:p>
+    <w:p>
+      <w:pPr>
+        <w:pStyle w:val="Heading2"/>
+      </w:pPr>
+      <w:r>
+        <w:t>Cathleen Liu activities 6 to 8</w:t>
+      </w:r>
+    </w:p>
+    <w:p>
+      <w:pPr>
+        <w:spacing w:after="80"/>
+      </w:pPr>
+      <w:r>
+        <w:rPr>
+          <w:sz w:val="20"/>
+        </w:rPr>
+        <w:t>6. Check funding eligibility, obtain funding approval and determine applicable charges.</w:t>
+      </w:r>
+    </w:p>
+    <w:p>
+      <w:pPr>
+        <w:spacing w:after="80"/>
+      </w:pPr>
+      <w:r>
+        <w:rPr>
+          <w:sz w:val="20"/>
+        </w:rPr>
+        <w:t>7. Request payments, record outcomes and investigate failed, duplicate or unconfirmed transactions.</w:t>
+      </w:r>
+    </w:p>
+    <w:p>
+      <w:pPr>
+        <w:spacing w:after="80"/>
+      </w:pPr>
+      <w:r>
+        <w:rPr>
+          <w:sz w:val="20"/>
+        </w:rPr>
+        <w:t>8. Deliver treatment, arrange tests and reviews, and assess fitness for further cycles.</w:t>
+      </w:r>
+    </w:p>
+    <w:p>
+      <w:pPr>
+        <w:pStyle w:val="Heading2"/>
+      </w:pPr>
+      <w:r>
+        <w:t>Songjie Qiu activities 9 to 13</w:t>
+      </w:r>
+    </w:p>
+    <w:p>
+      <w:pPr>
+        <w:spacing w:after="80"/>
+      </w:pPr>
+      <w:r>
+        <w:rPr>
+          <w:sz w:val="20"/>
+        </w:rPr>
+        <w:t>9. Authorise and manage treatment changes, postponements and urgent exceptions.</w:t>
+      </w:r>
+    </w:p>
+    <w:p>
+      <w:pPr>
+        <w:spacing w:after="80"/>
+      </w:pPr>
+      <w:r>
+        <w:rPr>
+          <w:sz w:val="20"/>
+        </w:rPr>
+        <w:t>10. Manage cancellations, declined appointments and non-attendance, including clinical review.</w:t>
+      </w:r>
+    </w:p>
+    <w:p>
+      <w:pPr>
+        <w:spacing w:after="80"/>
+      </w:pPr>
+      <w:r>
+        <w:rPr>
+          <w:sz w:val="20"/>
+        </w:rPr>
+        <w:t>11. Review payment transfers and approve, process and record refunds.</w:t>
+      </w:r>
+    </w:p>
+    <w:p>
+      <w:pPr>
+        <w:spacing w:after="80"/>
+      </w:pPr>
+      <w:r>
+        <w:rPr>
+          <w:sz w:val="20"/>
+        </w:rPr>
+        <w:t>12. Record, classify, prioritise, route and resolve patient enquiries.</w:t>
+      </w:r>
+    </w:p>
+    <w:p>
+      <w:pPr>
+        <w:spacing w:after="80"/>
+      </w:pPr>
+      <w:r>
+        <w:rPr>
+          <w:sz w:val="20"/>
+        </w:rPr>
+        <w:t>13. Prepare, approve, check and distribute clinic letters; monitor delays and escalate them.</w:t>
+      </w:r>
+    </w:p>
+    <w:p>
+      <w:pPr>
+        <w:pStyle w:val="Heading2"/>
+      </w:pPr>
+      <w:r>
+        <w:t>Chenyu Yang activities 14 to 16</w:t>
+      </w:r>
+    </w:p>
+    <w:p>
+      <w:pPr>
+        <w:spacing w:after="80"/>
+      </w:pPr>
+      <w:r>
+        <w:rPr>
+          <w:sz w:val="20"/>
+        </w:rPr>
+        <w:t>14. Request and book follow-up appointments and communicate arrangements.</w:t>
+      </w:r>
+    </w:p>
+    <w:p>
+      <w:pPr>
+        <w:spacing w:after="80"/>
+      </w:pPr>
+      <w:r>
+        <w:rPr>
+          <w:sz w:val="20"/>
+        </w:rPr>
+        <w:t>15. Monitor patient pathways and produce operational and financial reports.</w:t>
+      </w:r>
+    </w:p>
+    <w:p>
+      <w:pPr>
+        <w:spacing w:after="80"/>
+      </w:pPr>
+      <w:r>
+        <w:rPr>
+          <w:sz w:val="20"/>
+        </w:rPr>
+        <w:t>16. Maintain patient identity and records, control access, preserve audit trails and manage service outages.</w:t>
       </w:r>
     </w:p>
     <w:sectPr>

</xml_diff>